<commit_message>
edit [quiz - w10]
</commit_message>
<xml_diff>
--- a/3-G-3/5-week-5/4-worksheet/Computer Worksheet G3 W5 (Answer).docx
+++ b/3-G-3/5-week-5/4-worksheet/Computer Worksheet G3 W5 (Answer).docx
@@ -399,8 +399,9 @@
           <w:sz w:val="36"/>
           <w:szCs w:val="36"/>
         </w:rPr>
-        <w:t xml:space="preserve">heet No. (    </w:t>
-      </w:r>
+        <w:t xml:space="preserve">heet No. </w:t>
+      </w:r>
+      <w:proofErr w:type="gramStart"/>
       <w:r>
         <w:rPr>
           <w:rFonts w:ascii="Lucida Bright" w:hAnsi="Lucida Bright"/>
@@ -409,8 +410,9 @@
           <w:sz w:val="36"/>
           <w:szCs w:val="36"/>
         </w:rPr>
-        <w:t>5</w:t>
-      </w:r>
+        <w:t xml:space="preserve">(  </w:t>
+      </w:r>
+      <w:proofErr w:type="gramEnd"/>
       <w:r>
         <w:rPr>
           <w:rFonts w:ascii="Lucida Bright" w:hAnsi="Lucida Bright"/>
@@ -419,8 +421,40 @@
           <w:sz w:val="36"/>
           <w:szCs w:val="36"/>
         </w:rPr>
-        <w:t xml:space="preserve">   )</w:t>
-      </w:r>
+        <w:t xml:space="preserve">  </w:t>
+      </w:r>
+      <w:r>
+        <w:rPr>
+          <w:rFonts w:ascii="Lucida Bright" w:hAnsi="Lucida Bright"/>
+          <w:b/>
+          <w:bCs/>
+          <w:sz w:val="36"/>
+          <w:szCs w:val="36"/>
+        </w:rPr>
+        <w:t>5</w:t>
+      </w:r>
+      <w:r>
+        <w:rPr>
+          <w:rFonts w:ascii="Lucida Bright" w:hAnsi="Lucida Bright"/>
+          <w:b/>
+          <w:bCs/>
+          <w:sz w:val="36"/>
+          <w:szCs w:val="36"/>
+        </w:rPr>
+        <w:t xml:space="preserve"> </w:t>
+      </w:r>
+      <w:proofErr w:type="gramStart"/>
+      <w:r>
+        <w:rPr>
+          <w:rFonts w:ascii="Lucida Bright" w:hAnsi="Lucida Bright"/>
+          <w:b/>
+          <w:bCs/>
+          <w:sz w:val="36"/>
+          <w:szCs w:val="36"/>
+        </w:rPr>
+        <w:t xml:space="preserve">  )</w:t>
+      </w:r>
+      <w:proofErr w:type="gramEnd"/>
       <w:r>
         <w:rPr>
           <w:rFonts w:ascii="Lucida Bright" w:hAnsi="Lucida Bright"/>
@@ -738,7 +772,6 @@
                             <w:pPr>
                               <w:jc w:val="center"/>
                               <w:rPr>
-                                <w:rFonts w:hint="cs"/>
                                 <w:b/>
                                 <w:bCs/>
                                 <w:sz w:val="56"/>
@@ -783,7 +816,6 @@
                       <w:pPr>
                         <w:jc w:val="center"/>
                         <w:rPr>
-                          <w:rFonts w:hint="cs"/>
                           <w:b/>
                           <w:bCs/>
                           <w:sz w:val="56"/>
@@ -862,7 +894,6 @@
                             <w:pPr>
                               <w:jc w:val="center"/>
                               <w:rPr>
-                                <w:rFonts w:hint="cs"/>
                                 <w:b/>
                                 <w:bCs/>
                                 <w:sz w:val="56"/>
@@ -870,6 +901,7 @@
                                 <w:lang w:bidi="ar-EG"/>
                               </w:rPr>
                             </w:pPr>
+                            <w:proofErr w:type="spellStart"/>
                             <w:r>
                               <w:rPr>
                                 <w:b/>
@@ -880,6 +912,7 @@
                               </w:rPr>
                               <w:t>Calender</w:t>
                             </w:r>
+                            <w:proofErr w:type="spellEnd"/>
                           </w:p>
                         </w:txbxContent>
                       </wps:txbx>
@@ -907,7 +940,6 @@
                       <w:pPr>
                         <w:jc w:val="center"/>
                         <w:rPr>
-                          <w:rFonts w:hint="cs"/>
                           <w:b/>
                           <w:bCs/>
                           <w:sz w:val="56"/>
@@ -915,6 +947,7 @@
                           <w:lang w:bidi="ar-EG"/>
                         </w:rPr>
                       </w:pPr>
+                      <w:proofErr w:type="spellStart"/>
                       <w:r>
                         <w:rPr>
                           <w:b/>
@@ -925,6 +958,7 @@
                         </w:rPr>
                         <w:t>Calender</w:t>
                       </w:r>
+                      <w:proofErr w:type="spellEnd"/>
                     </w:p>
                   </w:txbxContent>
                 </v:textbox>
@@ -1555,7 +1589,7 @@
           </mc:Choice>
           <mc:Fallback>
             <w:pict>
-              <v:line w14:anchorId="00ED29AE" id="Straight Connector 9" o:spid="_x0000_s1026" style="position:absolute;left:0;text-align:left;z-index:251641856;visibility:visible;mso-wrap-style:square;mso-width-percent:0;mso-wrap-distance-left:9pt;mso-wrap-distance-top:0;mso-wrap-distance-right:9pt;mso-wrap-distance-bottom:0;mso-position-horizontal:absolute;mso-position-horizontal-relative:text;mso-position-vertical:absolute;mso-position-vertical-relative:text;mso-width-percent:0;mso-width-relative:margin" from="369pt,235.85pt" to="529.5pt,235.85pt" o:gfxdata="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" strokecolor="black [3200]" strokeweight="3pt">
+              <v:line w14:anchorId="4F912BAD" id="Straight Connector 9" o:spid="_x0000_s1026" style="position:absolute;left:0;text-align:left;z-index:251641856;visibility:visible;mso-wrap-style:square;mso-width-percent:0;mso-wrap-distance-left:9pt;mso-wrap-distance-top:0;mso-wrap-distance-right:9pt;mso-wrap-distance-bottom:0;mso-position-horizontal:absolute;mso-position-horizontal-relative:text;mso-position-vertical:absolute;mso-position-vertical-relative:text;mso-width-percent:0;mso-width-relative:margin" from="369pt,235.85pt" to="529.5pt,235.85pt" o:gfxdata="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" strokecolor="black [3200]" strokeweight="3pt">
                 <v:shadow on="t" color="black" opacity="22937f" origin=",.5" offset="0,.63889mm"/>
               </v:line>
             </w:pict>
@@ -1764,7 +1798,7 @@
           </mc:Choice>
           <mc:Fallback>
             <w:pict>
-              <v:line w14:anchorId="5DEAABEA" id="Straight Connector 9" o:spid="_x0000_s1026" style="position:absolute;left:0;text-align:left;z-index:251588608;visibility:visible;mso-wrap-style:square;mso-width-percent:0;mso-wrap-distance-left:9pt;mso-wrap-distance-top:0;mso-wrap-distance-right:9pt;mso-wrap-distance-bottom:0;mso-position-horizontal:absolute;mso-position-horizontal-relative:text;mso-position-vertical:absolute;mso-position-vertical-relative:text;mso-width-percent:0;mso-width-relative:margin" from="21.75pt,235.85pt" to="174.85pt,235.85pt" o:gfxdata="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" strokecolor="black [3200]" strokeweight="3pt">
+              <v:line w14:anchorId="321AA853" id="Straight Connector 9" o:spid="_x0000_s1026" style="position:absolute;left:0;text-align:left;z-index:251588608;visibility:visible;mso-wrap-style:square;mso-width-percent:0;mso-wrap-distance-left:9pt;mso-wrap-distance-top:0;mso-wrap-distance-right:9pt;mso-wrap-distance-bottom:0;mso-position-horizontal:absolute;mso-position-horizontal-relative:text;mso-position-vertical:absolute;mso-position-vertical-relative:text;mso-width-percent:0;mso-width-relative:margin" from="21.75pt,235.85pt" to="174.85pt,235.85pt" o:gfxdata="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" strokecolor="black [3200]" strokeweight="3pt">
                 <v:shadow on="t" color="black" opacity="22937f" origin=",.5" offset="0,.63889mm"/>
               </v:line>
             </w:pict>
@@ -1833,7 +1867,7 @@
           </mc:Choice>
           <mc:Fallback>
             <w:pict>
-              <v:line w14:anchorId="0A6C0EE3" id="Straight Connector 9" o:spid="_x0000_s1026" style="position:absolute;left:0;text-align:left;z-index:251609088;visibility:visible;mso-wrap-style:square;mso-width-percent:0;mso-wrap-distance-left:9pt;mso-wrap-distance-top:0;mso-wrap-distance-right:9pt;mso-wrap-distance-bottom:0;mso-position-horizontal:absolute;mso-position-horizontal-relative:text;mso-position-vertical:absolute;mso-position-vertical-relative:text;mso-width-percent:0;mso-width-relative:margin" from="21.75pt,403.85pt" to="180.1pt,403.85pt" o:gfxdata="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" strokecolor="black [3200]" strokeweight="3pt">
+              <v:line w14:anchorId="440C1997" id="Straight Connector 9" o:spid="_x0000_s1026" style="position:absolute;left:0;text-align:left;z-index:251609088;visibility:visible;mso-wrap-style:square;mso-width-percent:0;mso-wrap-distance-left:9pt;mso-wrap-distance-top:0;mso-wrap-distance-right:9pt;mso-wrap-distance-bottom:0;mso-position-horizontal:absolute;mso-position-horizontal-relative:text;mso-position-vertical:absolute;mso-position-vertical-relative:text;mso-width-percent:0;mso-width-relative:margin" from="21.75pt,403.85pt" to="180.1pt,403.85pt" o:gfxdata="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" strokecolor="black [3200]" strokeweight="3pt">
                 <v:shadow on="t" color="black" opacity="22937f" origin=",.5" offset="0,.63889mm"/>
               </v:line>
             </w:pict>
@@ -1902,7 +1936,7 @@
           </mc:Choice>
           <mc:Fallback>
             <w:pict>
-              <v:line w14:anchorId="380299C1" id="Straight Connector 9" o:spid="_x0000_s1026" style="position:absolute;left:0;text-align:left;z-index:251631616;visibility:visible;mso-wrap-style:square;mso-width-percent:0;mso-wrap-distance-left:9pt;mso-wrap-distance-top:0;mso-wrap-distance-right:9pt;mso-wrap-distance-bottom:0;mso-position-horizontal:absolute;mso-position-horizontal-relative:text;mso-position-vertical:absolute;mso-position-vertical-relative:text;mso-width-percent:0;mso-width-relative:margin" from="363pt,403.85pt" to="522.75pt,403.85pt" o:gfxdata="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" strokecolor="black [3200]" strokeweight="3pt">
+              <v:line w14:anchorId="6A10045E" id="Straight Connector 9" o:spid="_x0000_s1026" style="position:absolute;left:0;text-align:left;z-index:251631616;visibility:visible;mso-wrap-style:square;mso-width-percent:0;mso-wrap-distance-left:9pt;mso-wrap-distance-top:0;mso-wrap-distance-right:9pt;mso-wrap-distance-bottom:0;mso-position-horizontal:absolute;mso-position-horizontal-relative:text;mso-position-vertical:absolute;mso-position-vertical-relative:text;mso-width-percent:0;mso-width-relative:margin" from="363pt,403.85pt" to="522.75pt,403.85pt" o:gfxdata="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" strokecolor="black [3200]" strokeweight="3pt">
                 <v:shadow on="t" color="black" opacity="22937f" origin=",.5" offset="0,.63889mm"/>
               </v:line>
             </w:pict>
@@ -2081,16 +2115,12 @@
                                 <w:lang w:bidi="ar-EG"/>
                               </w:rPr>
                             </w:pPr>
-                            <w:bookmarkStart w:id="4" w:name="_Hlk210749064"/>
-                            <w:bookmarkStart w:id="5" w:name="_Hlk210749065"/>
                             <w:r>
                               <w:rPr>
                                 <w:lang w:bidi="ar-EG"/>
                               </w:rPr>
-                              <w:t>Calender</w:t>
+                              <w:t>Calendar</w:t>
                             </w:r>
-                            <w:bookmarkEnd w:id="4"/>
-                            <w:bookmarkEnd w:id="5"/>
                           </w:p>
                         </w:txbxContent>
                       </wps:txbx>
@@ -2121,16 +2151,12 @@
                           <w:lang w:bidi="ar-EG"/>
                         </w:rPr>
                       </w:pPr>
-                      <w:bookmarkStart w:id="6" w:name="_Hlk210749064"/>
-                      <w:bookmarkStart w:id="7" w:name="_Hlk210749065"/>
                       <w:r>
                         <w:rPr>
                           <w:lang w:bidi="ar-EG"/>
                         </w:rPr>
-                        <w:t>Calender</w:t>
+                        <w:t>Calendar</w:t>
                       </w:r>
-                      <w:bookmarkEnd w:id="6"/>
-                      <w:bookmarkEnd w:id="7"/>
                     </w:p>
                   </w:txbxContent>
                 </v:textbox>
@@ -2664,6 +2690,7 @@
   <w:style w:type="character" w:default="1" w:styleId="DefaultParagraphFont">
     <w:name w:val="Default Paragraph Font"/>
     <w:uiPriority w:val="1"/>
+    <w:semiHidden/>
     <w:unhideWhenUsed/>
   </w:style>
   <w:style w:type="table" w:default="1" w:styleId="TableNormal">

</xml_diff>